<commit_message>
v0.1.0: author-verified release build
Remove review stamps after author verification; fill repository URL and
release date; mark the verification checklist complete. NACEP proposal
and Indiana statement keep submission-time fields to fill when filed.

Co-Authored-By: Claude Opus 5.5 <noreply@anthropic.com>
Claude-Session: https://claude.ai/code/session_0144xtoRDqdjJuabdWMfMoeT
</commit_message>
<xml_diff>
--- a/paper/manuscript.docx
+++ b/paper/manuscript.docx
@@ -2,20 +2,6 @@
 <file path=word/document.xml><?xml version="1.0" encoding="utf-8"?>
 <w:document xmlns:wpc="http://schemas.microsoft.com/office/word/2010/wordprocessingCanvas" xmlns:mc="http://schemas.openxmlformats.org/markup-compatibility/2006" xmlns:o="urn:schemas-microsoft-com:office:office" xmlns:r="http://schemas.openxmlformats.org/officeDocument/2006/relationships" xmlns:m="http://schemas.openxmlformats.org/officeDocument/2006/math" xmlns:v="urn:schemas-microsoft-com:vml" xmlns:wp14="http://schemas.microsoft.com/office/word/2010/wordprocessingDrawing" xmlns:wp="http://schemas.openxmlformats.org/drawingml/2006/wordprocessingDrawing" xmlns:w10="urn:schemas-microsoft-com:office:word" xmlns:w="http://schemas.openxmlformats.org/wordprocessingml/2006/main" xmlns:w14="http://schemas.microsoft.com/office/word/2010/wordml" xmlns:w15="http://schemas.microsoft.com/office/word/2012/wordml" xmlns:wpg="http://schemas.microsoft.com/office/word/2010/wordprocessingGroup" xmlns:wpi="http://schemas.microsoft.com/office/word/2010/wordprocessingInk" xmlns:wne="http://schemas.microsoft.com/office/word/2006/wordml" xmlns:wps="http://schemas.microsoft.com/office/word/2010/wordprocessingShape" xmlns:cx="http://schemas.microsoft.com/office/drawing/2014/chartex" xmlns:cx1="http://schemas.microsoft.com/office/drawing/2015/9/8/chartex" xmlns:cx2="http://schemas.microsoft.com/office/drawing/2015/10/21/chartex" xmlns:cx3="http://schemas.microsoft.com/office/drawing/2016/5/9/chartex" xmlns:cx4="http://schemas.microsoft.com/office/drawing/2016/5/10/chartex" xmlns:cx5="http://schemas.microsoft.com/office/drawing/2016/5/11/chartex" xmlns:cx6="http://schemas.microsoft.com/office/drawing/2016/5/12/chartex" xmlns:cx7="http://schemas.microsoft.com/office/drawing/2016/5/13/chartex" xmlns:cx8="http://schemas.microsoft.com/office/drawing/2016/5/14/chartex" xmlns:aink="http://schemas.microsoft.com/office/drawing/2016/ink" xmlns:am3d="http://schemas.microsoft.com/office/drawing/2017/model3d" xmlns:w16cex="http://schemas.microsoft.com/office/word/2018/wordml/cex" xmlns:w16cid="http://schemas.microsoft.com/office/word/2016/wordml/cid" xmlns:w16="http://schemas.microsoft.com/office/word/2018/wordml" xmlns:w16sdtdh="http://schemas.microsoft.com/office/word/2020/wordml/sdtdatahash" xmlns:w16se="http://schemas.microsoft.com/office/word/2015/wordml/symex" mc:Ignorable="w14 w15 wp14">
   <w:body>
-    <w:p>
-      <w:pPr>
-        <w:spacing w:after="240"/>
-      </w:pPr>
-      <w:r>
-        <w:rPr>
-          <w:rFonts w:ascii="Times New Roman" w:cs="Times New Roman" w:eastAsia="Times New Roman" w:hAnsi="Times New Roman"/>
-          <w:b/>
-          <w:bCs/>
-          <w:color w:val="A32020"/>
-        </w:rPr>
-        <w:t xml:space="preserve">DRAFT — not verified by the author. Do not cite or circulate.</w:t>
-      </w:r>
-    </w:p>
     <w:p>
       <w:pPr>
         <w:spacing w:after="200"/>
@@ -9575,7 +9561,7 @@
         <w:rPr>
           <w:rFonts w:ascii="Times New Roman" w:cs="Times New Roman" w:eastAsia="Times New Roman" w:hAnsi="Times New Roman"/>
         </w:rPr>
-        <w:t xml:space="preserve"> All data are public. Code, processed data, figures, and the interactive atlas are available at [VERIFY: repository URL] and archived at [VERIFY: Zenodo DOI].</w:t>
+        <w:t xml:space="preserve"> All data are public. Code, processed data, figures, and the interactive atlas are available at https://github.com/OthnyLight/in-dual-credit-math.</w:t>
       </w:r>
     </w:p>
     <w:p>
@@ -10124,11 +10110,11 @@
     <w:r>
       <w:rPr>
         <w:rFonts w:ascii="Times New Roman" w:cs="Times New Roman" w:eastAsia="Times New Roman" w:hAnsi="Times New Roman"/>
-        <w:color w:val="A32020"/>
+        <w:color w:val="666666"/>
         <w:sz w:val="18"/>
         <w:szCs w:val="18"/>
       </w:rPr>
-      <w:t xml:space="preserve">DRAFT — Dual credit as a readiness lever</w:t>
+      <w:t xml:space="preserve">Dual credit as a readiness lever</w:t>
     </w:r>
   </w:p>
 </w:hdr>

</xml_diff>